<commit_message>
refactor(documentation): update terminology from 'application' to 'backend' for clarity and consistency
</commit_message>
<xml_diff>
--- a/BaoCao/cn-da22ttc-nguyenhuynhphuvinh-110122203-linvnix.docx
+++ b/BaoCao/cn-da22ttc-nguyenhuynhphuvinh-110122203-linvnix.docx
@@ -1857,21 +1857,7 @@
                               <w:rPr>
                                 <w:i/>
                               </w:rPr>
-                              <w:t xml:space="preserve">Trà Vinh, ngày </w:t>
-                            </w:r>
-                            <w:proofErr w:type="gramStart"/>
-                            <w:r>
-                              <w:rPr>
-                                <w:i/>
-                              </w:rPr>
-                              <w:t>…..</w:t>
-                            </w:r>
-                            <w:proofErr w:type="gramEnd"/>
-                            <w:r>
-                              <w:rPr>
-                                <w:i/>
-                              </w:rPr>
-                              <w:t xml:space="preserve"> tháng …… năm ……</w:t>
+                              <w:t>Trà Vinh, ngày ….. tháng …… năm ……</w:t>
                             </w:r>
                           </w:p>
                           <w:p>
@@ -2502,21 +2488,7 @@
                         <w:rPr>
                           <w:i/>
                         </w:rPr>
-                        <w:t xml:space="preserve">Trà Vinh, ngày </w:t>
-                      </w:r>
-                      <w:proofErr w:type="gramStart"/>
-                      <w:r>
-                        <w:rPr>
-                          <w:i/>
-                        </w:rPr>
-                        <w:t>…..</w:t>
-                      </w:r>
-                      <w:proofErr w:type="gramEnd"/>
-                      <w:r>
-                        <w:rPr>
-                          <w:i/>
-                        </w:rPr>
-                        <w:t xml:space="preserve"> tháng …… năm ……</w:t>
+                        <w:t>Trà Vinh, ngày ….. tháng …… năm ……</w:t>
                       </w:r>
                     </w:p>
                     <w:p>
@@ -2906,23 +2878,7 @@
           <w:i/>
           <w:szCs w:val="26"/>
         </w:rPr>
-        <w:t xml:space="preserve">Trà Vinh, ngày </w:t>
-      </w:r>
-      <w:proofErr w:type="gramStart"/>
-      <w:r>
-        <w:rPr>
-          <w:i/>
-          <w:szCs w:val="26"/>
-        </w:rPr>
-        <w:t>…..</w:t>
-      </w:r>
-      <w:proofErr w:type="gramEnd"/>
-      <w:r>
-        <w:rPr>
-          <w:i/>
-          <w:szCs w:val="26"/>
-        </w:rPr>
-        <w:t xml:space="preserve"> tháng …… năm ……</w:t>
+        <w:t>Trà Vinh, ngày ….. tháng …… năm ……</w:t>
       </w:r>
     </w:p>
     <w:p>
@@ -6051,23 +6007,7 @@
           <w:i/>
           <w:szCs w:val="26"/>
         </w:rPr>
-        <w:t xml:space="preserve">Vĩnh Long, ngày </w:t>
-      </w:r>
-      <w:proofErr w:type="gramStart"/>
-      <w:r>
-        <w:rPr>
-          <w:i/>
-          <w:szCs w:val="26"/>
-        </w:rPr>
-        <w:t>…..</w:t>
-      </w:r>
-      <w:proofErr w:type="gramEnd"/>
-      <w:r>
-        <w:rPr>
-          <w:i/>
-          <w:szCs w:val="26"/>
-        </w:rPr>
-        <w:t xml:space="preserve"> tháng …… năm ……</w:t>
+        <w:t>Vĩnh Long, ngày ….. tháng …… năm ……</w:t>
       </w:r>
     </w:p>
     <w:p>
@@ -6367,23 +6307,7 @@
           <w:i/>
           <w:szCs w:val="26"/>
         </w:rPr>
-        <w:t xml:space="preserve">Vĩnh Long, ngày </w:t>
-      </w:r>
-      <w:proofErr w:type="gramStart"/>
-      <w:r>
-        <w:rPr>
-          <w:i/>
-          <w:szCs w:val="26"/>
-        </w:rPr>
-        <w:t>…..</w:t>
-      </w:r>
-      <w:proofErr w:type="gramEnd"/>
-      <w:r>
-        <w:rPr>
-          <w:i/>
-          <w:szCs w:val="26"/>
-        </w:rPr>
-        <w:t xml:space="preserve"> tháng …… năm ……</w:t>
+        <w:t>Vĩnh Long, ngày ….. tháng …… năm ……</w:t>
       </w:r>
     </w:p>
     <w:p>
@@ -7283,7 +7207,7 @@
         </w:tabs>
       </w:pPr>
       <w:r>
-        <w:t>3.4.2 Tổ chức ứng dụng nền</w:t>
+        <w:t>3.4.2 Tổ chức backend</w:t>
       </w:r>
       <w:r>
         <w:tab/>
@@ -9226,161 +9150,7 @@
         <w:rPr>
           <w:szCs w:val="26"/>
         </w:rPr>
-        <w:t xml:space="preserve">Quản trị viên soạn học </w:t>
-      </w:r>
-      <w:proofErr w:type="spellStart"/>
-      <w:r>
-        <w:rPr>
-          <w:szCs w:val="26"/>
-        </w:rPr>
-        <w:t>liệu</w:t>
-      </w:r>
-      <w:proofErr w:type="spellEnd"/>
-      <w:r>
-        <w:rPr>
-          <w:szCs w:val="26"/>
-        </w:rPr>
-        <w:t xml:space="preserve">, </w:t>
-      </w:r>
-      <w:proofErr w:type="spellStart"/>
-      <w:r>
-        <w:rPr>
-          <w:szCs w:val="26"/>
-        </w:rPr>
-        <w:t>quản</w:t>
-      </w:r>
-      <w:proofErr w:type="spellEnd"/>
-      <w:r>
-        <w:rPr>
-          <w:szCs w:val="26"/>
-        </w:rPr>
-        <w:t xml:space="preserve"> </w:t>
-      </w:r>
-      <w:proofErr w:type="spellStart"/>
-      <w:r>
-        <w:rPr>
-          <w:szCs w:val="26"/>
-        </w:rPr>
-        <w:t>lý</w:t>
-      </w:r>
-      <w:proofErr w:type="spellEnd"/>
-      <w:r>
-        <w:rPr>
-          <w:szCs w:val="26"/>
-        </w:rPr>
-        <w:t xml:space="preserve"> </w:t>
-      </w:r>
-      <w:proofErr w:type="spellStart"/>
-      <w:r>
-        <w:rPr>
-          <w:szCs w:val="26"/>
-        </w:rPr>
-        <w:t>các</w:t>
-      </w:r>
-      <w:proofErr w:type="spellEnd"/>
-      <w:r>
-        <w:rPr>
-          <w:szCs w:val="26"/>
-        </w:rPr>
-        <w:t xml:space="preserve"> </w:t>
-      </w:r>
-      <w:proofErr w:type="spellStart"/>
-      <w:r>
-        <w:rPr>
-          <w:szCs w:val="26"/>
-        </w:rPr>
-        <w:t>hội</w:t>
-      </w:r>
-      <w:proofErr w:type="spellEnd"/>
-      <w:r>
-        <w:rPr>
-          <w:szCs w:val="26"/>
-        </w:rPr>
-        <w:t xml:space="preserve"> </w:t>
-      </w:r>
-      <w:proofErr w:type="spellStart"/>
-      <w:r>
-        <w:rPr>
-          <w:szCs w:val="26"/>
-        </w:rPr>
-        <w:t>thoại</w:t>
-      </w:r>
-      <w:proofErr w:type="spellEnd"/>
-      <w:r>
-        <w:rPr>
-          <w:szCs w:val="26"/>
-        </w:rPr>
-        <w:t xml:space="preserve"> </w:t>
-      </w:r>
-      <w:proofErr w:type="spellStart"/>
-      <w:r>
-        <w:rPr>
-          <w:szCs w:val="26"/>
-        </w:rPr>
-        <w:t>mô</w:t>
-      </w:r>
-      <w:proofErr w:type="spellEnd"/>
-      <w:r>
-        <w:rPr>
-          <w:szCs w:val="26"/>
-        </w:rPr>
-        <w:t xml:space="preserve"> </w:t>
-      </w:r>
-      <w:proofErr w:type="spellStart"/>
-      <w:r>
-        <w:rPr>
-          <w:szCs w:val="26"/>
-        </w:rPr>
-        <w:t>phỏng</w:t>
-      </w:r>
-      <w:proofErr w:type="spellEnd"/>
-      <w:r>
-        <w:rPr>
-          <w:szCs w:val="26"/>
-        </w:rPr>
-        <w:t xml:space="preserve"> </w:t>
-      </w:r>
-      <w:proofErr w:type="spellStart"/>
-      <w:r>
-        <w:rPr>
-          <w:szCs w:val="26"/>
-        </w:rPr>
-        <w:t>và</w:t>
-      </w:r>
-      <w:proofErr w:type="spellEnd"/>
-      <w:r>
-        <w:rPr>
-          <w:szCs w:val="26"/>
-        </w:rPr>
-        <w:t xml:space="preserve"> </w:t>
-      </w:r>
-      <w:proofErr w:type="spellStart"/>
-      <w:r>
-        <w:rPr>
-          <w:szCs w:val="26"/>
-        </w:rPr>
-        <w:t>xem</w:t>
-      </w:r>
-      <w:proofErr w:type="spellEnd"/>
-      <w:r>
-        <w:rPr>
-          <w:szCs w:val="26"/>
-        </w:rPr>
-        <w:t xml:space="preserve"> </w:t>
-      </w:r>
-      <w:proofErr w:type="spellStart"/>
-      <w:r>
-        <w:rPr>
-          <w:szCs w:val="26"/>
-        </w:rPr>
-        <w:t>thống</w:t>
-      </w:r>
-      <w:proofErr w:type="spellEnd"/>
-      <w:r>
-        <w:rPr>
-          <w:szCs w:val="26"/>
-        </w:rPr>
-        <w:t xml:space="preserve"> kê qua trang quản trị.</w:t>
+        <w:t>Quản trị viên soạn học liệu, quản lý các hội thoại mô phỏng và xem thống kê qua trang quản trị.</w:t>
       </w:r>
     </w:p>
     <w:p>
@@ -9396,105 +9166,7 @@
           <w:szCs w:val="26"/>
         </w:rPr>
         <w:lastRenderedPageBreak/>
-        <w:t xml:space="preserve">Bên cạnh các </w:t>
-      </w:r>
-      <w:proofErr w:type="spellStart"/>
-      <w:r>
-        <w:rPr>
-          <w:szCs w:val="26"/>
-        </w:rPr>
-        <w:t>kết</w:t>
-      </w:r>
-      <w:proofErr w:type="spellEnd"/>
-      <w:r>
-        <w:rPr>
-          <w:szCs w:val="26"/>
-        </w:rPr>
-        <w:t xml:space="preserve"> </w:t>
-      </w:r>
-      <w:proofErr w:type="spellStart"/>
-      <w:r>
-        <w:rPr>
-          <w:szCs w:val="26"/>
-        </w:rPr>
-        <w:t>quả</w:t>
-      </w:r>
-      <w:proofErr w:type="spellEnd"/>
-      <w:r>
-        <w:rPr>
-          <w:szCs w:val="26"/>
-        </w:rPr>
-        <w:t xml:space="preserve"> </w:t>
-      </w:r>
-      <w:proofErr w:type="spellStart"/>
-      <w:r>
-        <w:rPr>
-          <w:szCs w:val="26"/>
-        </w:rPr>
-        <w:t>trên</w:t>
-      </w:r>
-      <w:proofErr w:type="spellEnd"/>
-      <w:r>
-        <w:rPr>
-          <w:szCs w:val="26"/>
-        </w:rPr>
-        <w:t xml:space="preserve">, </w:t>
-      </w:r>
-      <w:proofErr w:type="spellStart"/>
-      <w:r>
-        <w:rPr>
-          <w:szCs w:val="26"/>
-        </w:rPr>
-        <w:t>tôi</w:t>
-      </w:r>
-      <w:proofErr w:type="spellEnd"/>
-      <w:r>
-        <w:rPr>
-          <w:szCs w:val="26"/>
-        </w:rPr>
-        <w:t xml:space="preserve"> </w:t>
-      </w:r>
-      <w:proofErr w:type="spellStart"/>
-      <w:r>
-        <w:rPr>
-          <w:szCs w:val="26"/>
-        </w:rPr>
-        <w:t>cũng</w:t>
-      </w:r>
-      <w:proofErr w:type="spellEnd"/>
-      <w:r>
-        <w:rPr>
-          <w:szCs w:val="26"/>
-        </w:rPr>
-        <w:t xml:space="preserve"> </w:t>
-      </w:r>
-      <w:proofErr w:type="spellStart"/>
-      <w:r>
-        <w:rPr>
-          <w:szCs w:val="26"/>
-        </w:rPr>
-        <w:t>có</w:t>
-      </w:r>
-      <w:proofErr w:type="spellEnd"/>
-      <w:r>
-        <w:rPr>
-          <w:szCs w:val="26"/>
-        </w:rPr>
-        <w:t xml:space="preserve"> </w:t>
-      </w:r>
-      <w:proofErr w:type="spellStart"/>
-      <w:r>
-        <w:rPr>
-          <w:szCs w:val="26"/>
-        </w:rPr>
-        <w:t>được</w:t>
-      </w:r>
-      <w:proofErr w:type="spellEnd"/>
-      <w:r>
-        <w:rPr>
-          <w:szCs w:val="26"/>
-        </w:rPr>
-        <w:t xml:space="preserve"> kinh nghiệm làm việc trên một sản phẩm có đủ ba phần mobile, web quản trị và máy chủ, cùng cách tích hợp một mô hình AI đa phương thức vào quy trình thật.</w:t>
+        <w:t>Bên cạnh các kết quả trên, tôi cũng có được kinh nghiệm làm việc trên một sản phẩm có đủ ba phần mobile, web quản trị và máy chủ, cùng cách tích hợp một mô hình AI đa phương thức vào quy trình thật.</w:t>
       </w:r>
     </w:p>
     <w:p>
@@ -9530,55 +9202,7 @@
         <w:t>Lý do chọn đề tài:</w:t>
       </w:r>
       <w:r>
-        <w:t xml:space="preserve"> Tiếng Việt có nhiều đặc điểm khó với người nước ngoài: hệ thống thanh điệu, nhiều âm tiết, các phương ngữ vùng miền và ngữ pháp khác xa các ngôn ngữ châu Âu. Hiện nay đã có một số ứng dụng học ngôn ngữ phổ biến nhưng phần dành cho tiếng Việt còn ít, chưa chú trọng phát âm và phương ngữ, và chưa tận dụng các tính năng AI hiện có. </w:t>
-      </w:r>
-      <w:proofErr w:type="spellStart"/>
-      <w:r>
-        <w:t>Vì</w:t>
-      </w:r>
-      <w:proofErr w:type="spellEnd"/>
-      <w:r>
-        <w:t xml:space="preserve"> </w:t>
-      </w:r>
-      <w:proofErr w:type="spellStart"/>
-      <w:r>
-        <w:t>vậy</w:t>
-      </w:r>
-      <w:proofErr w:type="spellEnd"/>
-      <w:r>
-        <w:t xml:space="preserve"> </w:t>
-      </w:r>
-      <w:proofErr w:type="spellStart"/>
-      <w:r>
-        <w:t>tôi</w:t>
-      </w:r>
-      <w:proofErr w:type="spellEnd"/>
-      <w:r>
-        <w:t xml:space="preserve"> </w:t>
-      </w:r>
-      <w:proofErr w:type="spellStart"/>
-      <w:r>
-        <w:t>chọn</w:t>
-      </w:r>
-      <w:proofErr w:type="spellEnd"/>
-      <w:r>
-        <w:t xml:space="preserve"> </w:t>
-      </w:r>
-      <w:proofErr w:type="spellStart"/>
-      <w:r>
-        <w:t>đề</w:t>
-      </w:r>
-      <w:proofErr w:type="spellEnd"/>
-      <w:r>
-        <w:t xml:space="preserve"> </w:t>
-      </w:r>
-      <w:proofErr w:type="spellStart"/>
-      <w:r>
-        <w:t>tài</w:t>
-      </w:r>
-      <w:proofErr w:type="spellEnd"/>
-      <w:r>
-        <w:t xml:space="preserve"> này để xây dựng một ứng dụng học tiếng Việt vừa có học liệu được tổ chức theo cấp độ chuẩn châu Âu vừa có các tính năng AI hỗ trợ học viên trong quá trình học.</w:t>
+        <w:t xml:space="preserve"> Tiếng Việt có nhiều đặc điểm khó với người nước ngoài: hệ thống thanh điệu, nhiều âm tiết, các phương ngữ vùng miền và ngữ pháp khác xa các ngôn ngữ châu Âu. Hiện nay đã có một số ứng dụng học ngôn ngữ phổ biến nhưng phần dành cho tiếng Việt còn ít, chưa chú trọng phát âm và phương ngữ, và chưa tận dụng các tính năng AI hiện có. Vì vậy tôi chọn đề tài này để xây dựng một ứng dụng học tiếng Việt vừa có học liệu được tổ chức theo cấp độ chuẩn châu Âu vừa có các tính năng AI hỗ trợ học viên trong quá trình học.</w:t>
       </w:r>
     </w:p>
     <w:p>
@@ -9775,141 +9399,8 @@
       <w:pPr>
         <w:pStyle w:val="BodyText1"/>
       </w:pPr>
-      <w:proofErr w:type="spellStart"/>
-      <w:r>
-        <w:t>Đề</w:t>
-      </w:r>
-      <w:proofErr w:type="spellEnd"/>
-      <w:r>
-        <w:t xml:space="preserve"> </w:t>
-      </w:r>
-      <w:proofErr w:type="spellStart"/>
-      <w:r>
-        <w:t>tài</w:t>
-      </w:r>
-      <w:proofErr w:type="spellEnd"/>
-      <w:r>
-        <w:t xml:space="preserve"> “</w:t>
-      </w:r>
-      <w:proofErr w:type="spellStart"/>
-      <w:r>
-        <w:t>Ứng</w:t>
-      </w:r>
-      <w:proofErr w:type="spellEnd"/>
-      <w:r>
-        <w:t xml:space="preserve"> </w:t>
-      </w:r>
-      <w:proofErr w:type="spellStart"/>
-      <w:r>
-        <w:t>dụng</w:t>
-      </w:r>
-      <w:proofErr w:type="spellEnd"/>
-      <w:r>
-        <w:t xml:space="preserve"> hỗ trợ dạy học tiếng Việt với trí tuệ nhân tạo” hướng đến xây dựng một ứng dụng học tiếng Việt cho người nước ngoài có học liệu được tổ chức bài bản và có sự hỗ trợ của AI. Sản phẩm gồm </w:t>
-      </w:r>
-      <w:proofErr w:type="spellStart"/>
-      <w:r>
-        <w:t>ba</w:t>
-      </w:r>
-      <w:proofErr w:type="spellEnd"/>
-      <w:r>
-        <w:t xml:space="preserve"> phần chính là ứng dụng di động dành cho học viên, trang quản trị dành </w:t>
-      </w:r>
-      <w:proofErr w:type="spellStart"/>
-      <w:r>
-        <w:t>cho</w:t>
-      </w:r>
-      <w:proofErr w:type="spellEnd"/>
-      <w:r>
-        <w:t xml:space="preserve"> </w:t>
-      </w:r>
-      <w:proofErr w:type="spellStart"/>
-      <w:r>
-        <w:t>quản</w:t>
-      </w:r>
-      <w:proofErr w:type="spellEnd"/>
-      <w:r>
-        <w:t xml:space="preserve"> </w:t>
-      </w:r>
-      <w:proofErr w:type="spellStart"/>
-      <w:r>
-        <w:t>trị</w:t>
-      </w:r>
-      <w:proofErr w:type="spellEnd"/>
-      <w:r>
-        <w:t xml:space="preserve"> </w:t>
-      </w:r>
-      <w:proofErr w:type="spellStart"/>
-      <w:r>
-        <w:t>viên</w:t>
-      </w:r>
-      <w:proofErr w:type="spellEnd"/>
-      <w:r>
-        <w:t xml:space="preserve"> </w:t>
-      </w:r>
-      <w:proofErr w:type="spellStart"/>
-      <w:r>
-        <w:t>và</w:t>
-      </w:r>
-      <w:proofErr w:type="spellEnd"/>
-      <w:r>
-        <w:t xml:space="preserve"> </w:t>
-      </w:r>
-      <w:proofErr w:type="spellStart"/>
-      <w:r>
-        <w:t>máy</w:t>
-      </w:r>
-      <w:proofErr w:type="spellEnd"/>
-      <w:r>
-        <w:t xml:space="preserve"> </w:t>
-      </w:r>
-      <w:proofErr w:type="spellStart"/>
-      <w:r>
-        <w:t>chủ</w:t>
-      </w:r>
-      <w:proofErr w:type="spellEnd"/>
-      <w:r>
-        <w:t xml:space="preserve"> </w:t>
-      </w:r>
-      <w:proofErr w:type="spellStart"/>
-      <w:r>
-        <w:t>dùng</w:t>
-      </w:r>
-      <w:proofErr w:type="spellEnd"/>
-      <w:r>
-        <w:t xml:space="preserve"> </w:t>
-      </w:r>
-      <w:proofErr w:type="spellStart"/>
-      <w:r>
-        <w:t>chung</w:t>
-      </w:r>
-      <w:proofErr w:type="spellEnd"/>
-      <w:r>
-        <w:t xml:space="preserve"> </w:t>
-      </w:r>
-      <w:proofErr w:type="spellStart"/>
-      <w:r>
-        <w:t>cho</w:t>
-      </w:r>
-      <w:proofErr w:type="spellEnd"/>
-      <w:r>
-        <w:t xml:space="preserve"> </w:t>
-      </w:r>
-      <w:proofErr w:type="spellStart"/>
-      <w:r>
-        <w:t>cả</w:t>
-      </w:r>
-      <w:proofErr w:type="spellEnd"/>
-      <w:r>
-        <w:t xml:space="preserve"> </w:t>
-      </w:r>
-      <w:proofErr w:type="spellStart"/>
-      <w:r>
-        <w:t>hai</w:t>
-      </w:r>
-      <w:proofErr w:type="spellEnd"/>
-      <w:r>
-        <w:t>.</w:t>
+      <w:r>
+        <w:t>Đề tài “Ứng dụng hỗ trợ dạy học tiếng Việt với trí tuệ nhân tạo” hướng đến xây dựng một ứng dụng học tiếng Việt cho người nước ngoài có học liệu được tổ chức bài bản và có sự hỗ trợ của AI. Sản phẩm gồm ba phần chính là ứng dụng di động dành cho học viên, trang quản trị dành cho quản trị viên và máy chủ dùng chung cho cả hai.</w:t>
       </w:r>
     </w:p>
     <w:p>
@@ -9925,167 +9416,7 @@
         <w:pStyle w:val="BodyText1"/>
       </w:pPr>
       <w:r>
-        <w:t xml:space="preserve">Ngoài học liệu cố định, ứng dụng tích hợp bốn tính năng AI để việc học sát với thực tế hơn. Tính năng sinh bài tập tự động tạo bài tập theo </w:t>
-      </w:r>
-      <w:proofErr w:type="spellStart"/>
-      <w:r>
-        <w:t>nội</w:t>
-      </w:r>
-      <w:proofErr w:type="spellEnd"/>
-      <w:r>
-        <w:t xml:space="preserve"> dung </w:t>
-      </w:r>
-      <w:proofErr w:type="spellStart"/>
-      <w:r>
-        <w:t>bài</w:t>
-      </w:r>
-      <w:proofErr w:type="spellEnd"/>
-      <w:r>
-        <w:t xml:space="preserve"> </w:t>
-      </w:r>
-      <w:proofErr w:type="spellStart"/>
-      <w:r>
-        <w:t>học</w:t>
-      </w:r>
-      <w:proofErr w:type="spellEnd"/>
-      <w:r>
-        <w:t xml:space="preserve">. Tính năng khám phá ảnh cho phép học viên chụp ảnh đồ vật xung quanh để AI giải thích và đưa ra từ vựng tiếng Việt liên quan. Tính năng hội thoại mô phỏng đặt học viên vào các tình huống giao tiếp như đi mua sắm hay đi nhà hàng và để AI đóng vai nhân vật trao đổi tin </w:t>
-      </w:r>
-      <w:proofErr w:type="spellStart"/>
-      <w:r>
-        <w:t>nhắn</w:t>
-      </w:r>
-      <w:proofErr w:type="spellEnd"/>
-      <w:r>
-        <w:t xml:space="preserve"> </w:t>
-      </w:r>
-      <w:proofErr w:type="spellStart"/>
-      <w:r>
-        <w:t>cùng</w:t>
-      </w:r>
-      <w:proofErr w:type="spellEnd"/>
-      <w:r>
-        <w:t xml:space="preserve"> </w:t>
-      </w:r>
-      <w:proofErr w:type="spellStart"/>
-      <w:r>
-        <w:t>học</w:t>
-      </w:r>
-      <w:proofErr w:type="spellEnd"/>
-      <w:r>
-        <w:t xml:space="preserve"> </w:t>
-      </w:r>
-      <w:proofErr w:type="spellStart"/>
-      <w:r>
-        <w:t>viên</w:t>
-      </w:r>
-      <w:proofErr w:type="spellEnd"/>
-      <w:r>
-        <w:t xml:space="preserve"> </w:t>
-      </w:r>
-      <w:proofErr w:type="spellStart"/>
-      <w:r>
-        <w:t>và</w:t>
-      </w:r>
-      <w:proofErr w:type="spellEnd"/>
-      <w:r>
-        <w:t xml:space="preserve"> </w:t>
-      </w:r>
-      <w:proofErr w:type="spellStart"/>
-      <w:r>
-        <w:t>phản</w:t>
-      </w:r>
-      <w:proofErr w:type="spellEnd"/>
-      <w:r>
-        <w:t xml:space="preserve"> </w:t>
-      </w:r>
-      <w:proofErr w:type="spellStart"/>
-      <w:r>
-        <w:t>hồi</w:t>
-      </w:r>
-      <w:proofErr w:type="spellEnd"/>
-      <w:r>
-        <w:t xml:space="preserve"> </w:t>
-      </w:r>
-      <w:proofErr w:type="spellStart"/>
-      <w:r>
-        <w:t>ngữ</w:t>
-      </w:r>
-      <w:proofErr w:type="spellEnd"/>
-      <w:r>
-        <w:t xml:space="preserve"> </w:t>
-      </w:r>
-      <w:proofErr w:type="spellStart"/>
-      <w:r>
-        <w:t>pháp</w:t>
-      </w:r>
-      <w:proofErr w:type="spellEnd"/>
-      <w:r>
-        <w:t xml:space="preserve"> </w:t>
-      </w:r>
-      <w:proofErr w:type="spellStart"/>
-      <w:r>
-        <w:t>sau</w:t>
-      </w:r>
-      <w:proofErr w:type="spellEnd"/>
-      <w:r>
-        <w:t xml:space="preserve"> </w:t>
-      </w:r>
-      <w:proofErr w:type="spellStart"/>
-      <w:r>
-        <w:t>mỗi</w:t>
-      </w:r>
-      <w:proofErr w:type="spellEnd"/>
-      <w:r>
-        <w:t xml:space="preserve"> </w:t>
-      </w:r>
-      <w:proofErr w:type="spellStart"/>
-      <w:r>
-        <w:t>câu</w:t>
-      </w:r>
-      <w:proofErr w:type="spellEnd"/>
-      <w:r>
-        <w:t xml:space="preserve"> </w:t>
-      </w:r>
-      <w:proofErr w:type="spellStart"/>
-      <w:r>
-        <w:t>trả</w:t>
-      </w:r>
-      <w:proofErr w:type="spellEnd"/>
-      <w:r>
-        <w:t xml:space="preserve"> </w:t>
-      </w:r>
-      <w:proofErr w:type="spellStart"/>
-      <w:r>
-        <w:t>lời</w:t>
-      </w:r>
-      <w:proofErr w:type="spellEnd"/>
-      <w:r>
-        <w:t xml:space="preserve"> </w:t>
-      </w:r>
-      <w:proofErr w:type="spellStart"/>
-      <w:r>
-        <w:t>của</w:t>
-      </w:r>
-      <w:proofErr w:type="spellEnd"/>
-      <w:r>
-        <w:t xml:space="preserve"> </w:t>
-      </w:r>
-      <w:proofErr w:type="spellStart"/>
-      <w:r>
-        <w:t>học</w:t>
-      </w:r>
-      <w:proofErr w:type="spellEnd"/>
-      <w:r>
-        <w:t xml:space="preserve"> </w:t>
-      </w:r>
-      <w:proofErr w:type="spellStart"/>
-      <w:r>
-        <w:t>viên</w:t>
-      </w:r>
-      <w:proofErr w:type="spellEnd"/>
-      <w:r>
-        <w:t>. Tính năng trợ lý AI trả lời câu hỏi của học viên dựa trên màn hình hiện tại và dữ liệu học tập cá nhân.</w:t>
+        <w:t>Ngoài học liệu cố định, ứng dụng tích hợp bốn tính năng AI để việc học sát với thực tế hơn. Tính năng sinh bài tập tự động tạo bài tập theo nội dung bài học. Tính năng khám phá ảnh cho phép học viên chụp ảnh đồ vật xung quanh để AI giải thích và đưa ra từ vựng tiếng Việt liên quan. Tính năng hội thoại mô phỏng đặt học viên vào các tình huống giao tiếp như đi mua sắm hay đi nhà hàng và để AI đóng vai nhân vật trao đổi tin nhắn cùng học viên và phản hồi ngữ pháp sau mỗi câu trả lời của học viên. Tính năng trợ lý AI trả lời câu hỏi của học viên dựa trên màn hình hiện tại và dữ liệu học tập cá nhân.</w:t>
       </w:r>
     </w:p>
     <w:p>
@@ -10093,39 +9424,7 @@
         <w:pStyle w:val="BodyText1"/>
       </w:pPr>
       <w:r>
-        <w:t xml:space="preserve">Trang quản trị giúp quản trị viên soạn khóa học, chủ đề, bài học, từ vựng, quy tắc ngữ pháp và bài tập; quản lý tình huống cho tính năng </w:t>
-      </w:r>
-      <w:proofErr w:type="spellStart"/>
-      <w:r>
-        <w:t>hội</w:t>
-      </w:r>
-      <w:proofErr w:type="spellEnd"/>
-      <w:r>
-        <w:t xml:space="preserve"> </w:t>
-      </w:r>
-      <w:proofErr w:type="spellStart"/>
-      <w:r>
-        <w:t>thoại</w:t>
-      </w:r>
-      <w:proofErr w:type="spellEnd"/>
-      <w:r>
-        <w:t xml:space="preserve"> </w:t>
-      </w:r>
-      <w:proofErr w:type="spellStart"/>
-      <w:r>
-        <w:t>mô</w:t>
-      </w:r>
-      <w:proofErr w:type="spellEnd"/>
-      <w:r>
-        <w:t xml:space="preserve"> </w:t>
-      </w:r>
-      <w:proofErr w:type="spellStart"/>
-      <w:r>
-        <w:t>phỏng</w:t>
-      </w:r>
-      <w:proofErr w:type="spellEnd"/>
-      <w:r>
-        <w:t>. Toàn bộ dữ liệu được lưu trên máy chủ và đồng bộ với ứng dụng di động.</w:t>
+        <w:t>Trang quản trị giúp quản trị viên soạn khóa học, chủ đề, bài học, từ vựng, quy tắc ngữ pháp và bài tập; quản lý tình huống cho tính năng hội thoại mô phỏng. Toàn bộ dữ liệu được lưu trên máy chủ và đồng bộ với ứng dụng di động.</w:t>
       </w:r>
     </w:p>
     <w:p>
@@ -10180,55 +9479,7 @@
         <w:pStyle w:val="BodyText1"/>
       </w:pPr>
       <w:r>
-        <w:t xml:space="preserve">Khung tham chiếu chung châu Âu về ngôn ngữ (Common European Framework of Reference for Languages, viết tắt CEFR) là chuẩn quốc tế do Hội đồng châu Âu xây dựng để mô tả năng lực ngôn ngữ ở các kỹ năng nghe, nói, đọc, viết. CEFR chia năng lực thành ba nhóm với sáu cấp độ: A1 và A2 cho người mới </w:t>
-      </w:r>
-      <w:proofErr w:type="spellStart"/>
-      <w:r>
-        <w:t>học</w:t>
-      </w:r>
-      <w:proofErr w:type="spellEnd"/>
-      <w:r>
-        <w:t xml:space="preserve">, B1 và B2 cho người dùng độc </w:t>
-      </w:r>
-      <w:proofErr w:type="spellStart"/>
-      <w:r>
-        <w:t>lập</w:t>
-      </w:r>
-      <w:proofErr w:type="spellEnd"/>
-      <w:r>
-        <w:t xml:space="preserve">, C1 và C2 cho </w:t>
-      </w:r>
-      <w:proofErr w:type="spellStart"/>
-      <w:r>
-        <w:t>người</w:t>
-      </w:r>
-      <w:proofErr w:type="spellEnd"/>
-      <w:r>
-        <w:t xml:space="preserve"> </w:t>
-      </w:r>
-      <w:proofErr w:type="spellStart"/>
-      <w:r>
-        <w:t>dùng</w:t>
-      </w:r>
-      <w:proofErr w:type="spellEnd"/>
-      <w:r>
-        <w:t xml:space="preserve"> </w:t>
-      </w:r>
-      <w:proofErr w:type="spellStart"/>
-      <w:r>
-        <w:t>thành</w:t>
-      </w:r>
-      <w:proofErr w:type="spellEnd"/>
-      <w:r>
-        <w:t xml:space="preserve"> </w:t>
-      </w:r>
-      <w:proofErr w:type="spellStart"/>
-      <w:r>
-        <w:t>thạo</w:t>
-      </w:r>
-      <w:proofErr w:type="spellEnd"/>
-      <w:r>
-        <w:t>. [1]</w:t>
+        <w:t>Khung tham chiếu chung châu Âu về ngôn ngữ (Common European Framework of Reference for Languages, viết tắt CEFR) là chuẩn quốc tế do Hội đồng châu Âu xây dựng để mô tả năng lực ngôn ngữ ở các kỹ năng nghe, nói, đọc, viết. CEFR chia năng lực thành ba nhóm với sáu cấp độ: A1 và A2 cho người mới học, B1 và B2 cho người dùng độc lập, C1 và C2 cho người dùng thành thạo. [1]</w:t>
       </w:r>
     </w:p>
     <w:p>
@@ -10251,37 +9502,8 @@
       <w:pPr>
         <w:pStyle w:val="BodyText1"/>
       </w:pPr>
-      <w:proofErr w:type="spellStart"/>
-      <w:r>
-        <w:t>Đề</w:t>
-      </w:r>
-      <w:proofErr w:type="spellEnd"/>
-      <w:r>
-        <w:t xml:space="preserve"> </w:t>
-      </w:r>
-      <w:proofErr w:type="spellStart"/>
-      <w:r>
-        <w:t>tài</w:t>
-      </w:r>
-      <w:proofErr w:type="spellEnd"/>
-      <w:r>
-        <w:t xml:space="preserve"> </w:t>
-      </w:r>
-      <w:proofErr w:type="spellStart"/>
-      <w:r>
-        <w:t>lấy</w:t>
-      </w:r>
-      <w:proofErr w:type="spellEnd"/>
-      <w:r>
-        <w:t xml:space="preserve"> </w:t>
-      </w:r>
-      <w:proofErr w:type="spellStart"/>
-      <w:r>
-        <w:t>khung</w:t>
-      </w:r>
-      <w:proofErr w:type="spellEnd"/>
-      <w:r>
-        <w:t xml:space="preserve"> sáu bậc nói trên làm chuẩn để chia các khóa học trong ứng dụng. Mỗi khóa học gắn với một bậc, các chủ đề và bài học bên trong được sắp xếp tăng dần độ khó. Cách chia này giúp học viên biết được mình đang ở đâu, cần học gì </w:t>
+      <w:r>
+        <w:t xml:space="preserve">Đề tài lấy khung sáu bậc nói trên làm chuẩn để chia các khóa học trong ứng dụng. Mỗi khóa học gắn với một bậc, các chủ đề và bài học bên trong được sắp xếp tăng dần độ khó. Cách chia này giúp học viên biết được mình đang ở đâu, cần học gì </w:t>
       </w:r>
       <w:r>
         <w:lastRenderedPageBreak/>
@@ -10592,15 +9814,7 @@
         <w:pStyle w:val="BodyText1"/>
       </w:pPr>
       <w:r>
-        <w:t xml:space="preserve">Mô hình lập trình của Flutter dựa trên triết lý "everything is a widget". Mỗi phần giao diện là một widget bất biến mô tả nó trông như thế nào và phản ứng ra sao theo trạng thái. Widget được chia thành hai nhóm: StatelessWidget không có trạng thái nội bộ, và StatefulWidget có trạng thái và gọi </w:t>
-      </w:r>
-      <w:proofErr w:type="gramStart"/>
-      <w:r>
-        <w:t>setState(</w:t>
-      </w:r>
-      <w:proofErr w:type="gramEnd"/>
-      <w:r>
-        <w:t>) để yêu cầu Flutter dựng lại giao diện khi trạng thái thay đổi. Quá trình phát triển được hỗ trợ bởi tính năng hot reload, tức thay đổi trong mã được áp dụng ngay vào ứng dụng đang chạy mà không cần khởi động lại.</w:t>
+        <w:t>Mô hình lập trình của Flutter dựa trên triết lý "everything is a widget". Mỗi phần giao diện là một widget bất biến mô tả nó trông như thế nào và phản ứng ra sao theo trạng thái. Widget được chia thành hai nhóm: StatelessWidget không có trạng thái nội bộ, và StatefulWidget có trạng thái và gọi setState() để yêu cầu Flutter dựng lại giao diện khi trạng thái thay đổi. Quá trình phát triển được hỗ trợ bởi tính năng hot reload, tức thay đổi trong mã được áp dụng ngay vào ứng dụng đang chạy mà không cần khởi động lại.</w:t>
       </w:r>
     </w:p>
     <w:p>
@@ -10758,15 +9972,7 @@
         <w:pStyle w:val="BodyText1"/>
       </w:pPr>
       <w:r>
-        <w:t xml:space="preserve">React tổ chức giao diện theo các thành phần (component) tái sử dụng được. Mỗi component nhận dữ liệu vào qua các thuộc tính (props) và quản lý trạng thái nội bộ (state) của riêng nó. Khi state hoặc props thay đổi, </w:t>
-      </w:r>
-      <w:proofErr w:type="gramStart"/>
-      <w:r>
-        <w:t>React</w:t>
-      </w:r>
-      <w:proofErr w:type="gramEnd"/>
-      <w:r>
-        <w:t xml:space="preserve"> tự dựng lại phần giao diện do component đó sinh ra. Dữ liệu trong React đi theo một chiều từ trên xuống: component cha truyền props cho component con, hành động từ con báo lên cha qua các callback. Mô hình một chiều này giúp luồng dữ liệu rõ ràng và dễ suy luận.</w:t>
+        <w:t>React tổ chức giao diện theo các thành phần (component) tái sử dụng được. Mỗi component nhận dữ liệu vào qua các thuộc tính (props) và quản lý trạng thái nội bộ (state) của riêng nó. Khi state hoặc props thay đổi, React tự dựng lại phần giao diện do component đó sinh ra. Dữ liệu trong React đi theo một chiều từ trên xuống: component cha truyền props cho component con, hành động từ con báo lên cha qua các callback. Mô hình một chiều này giúp luồng dữ liệu rõ ràng và dễ suy luận.</w:t>
       </w:r>
     </w:p>
     <w:p>
@@ -10774,15 +9980,7 @@
         <w:pStyle w:val="BodyText1"/>
       </w:pPr>
       <w:r>
-        <w:t xml:space="preserve">Để tránh thao tác trực tiếp lên DOM của trình duyệt vốn tốn chi phí, </w:t>
-      </w:r>
-      <w:proofErr w:type="gramStart"/>
-      <w:r>
-        <w:t>React</w:t>
-      </w:r>
-      <w:proofErr w:type="gramEnd"/>
-      <w:r>
-        <w:t xml:space="preserve"> dùng một cấu trúc trung gian là Virtual DOM. Khi state thay đổi, React dựng một cây Virtual DOM mới, so sánh với cây cũ rồi chỉ áp các thay đổi cần thiết lên DOM thật. Quá trình so sánh được gọi là reconciliation và được điều phối bởi cơ chế Fiber giới thiệu từ năm 2017, chia công việc dựng lại giao diện thành các phần nhỏ trải qua nhiều khung hình để giao diện không bị giật.</w:t>
+        <w:t>Để tránh thao tác trực tiếp lên DOM của trình duyệt vốn tốn chi phí, React dùng một cấu trúc trung gian là Virtual DOM. Khi state thay đổi, React dựng một cây Virtual DOM mới, so sánh với cây cũ rồi chỉ áp các thay đổi cần thiết lên DOM thật. Quá trình so sánh được gọi là reconciliation và được điều phối bởi cơ chế Fiber giới thiệu từ năm 2017, chia công việc dựng lại giao diện thành các phần nhỏ trải qua nhiều khung hình để giao diện không bị giật.</w:t>
       </w:r>
     </w:p>
     <w:p>
@@ -10842,15 +10040,7 @@
         <w:pStyle w:val="BodyText1"/>
       </w:pPr>
       <w:r>
-        <w:t xml:space="preserve">Trong đề tài, </w:t>
-      </w:r>
-      <w:proofErr w:type="gramStart"/>
-      <w:r>
-        <w:t>React</w:t>
-      </w:r>
-      <w:proofErr w:type="gramEnd"/>
-      <w:r>
-        <w:t xml:space="preserve"> được dùng cho trang quản trị vì giao diện phía quản trị viên gồm nhiều form soạn học liệu, bảng danh sách, biểu đồ thống kê, đều là các tình huống React xử lý tốt. Hệ sinh thái thư viện như TanStack Query cho quản lý dữ liệu phía client, TanStack Router cho điều hướng, shadcn/ui cho thành phần giao diện giúp tốc độ phát triển nhanh.</w:t>
+        <w:t>Trong đề tài, React được dùng cho trang quản trị vì giao diện phía quản trị viên gồm nhiều form soạn học liệu, bảng danh sách, biểu đồ thống kê, đều là các tình huống React xử lý tốt. Hệ sinh thái thư viện như TanStack Query cho quản lý dữ liệu phía client, TanStack Router cho điều hướng, shadcn/ui cho thành phần giao diện giúp tốc độ phát triển nhanh.</w:t>
       </w:r>
     </w:p>
     <w:p>
@@ -11224,39 +10414,7 @@
         </w:rPr>
       </w:pPr>
       <w:r>
-        <w:t xml:space="preserve">Một mô hình thị giác - ngôn ngữ tổng quát thường gồm ba phần. Phần encoder ảnh nhận ảnh đầu vào và biến nó thành một dãy embedding biểu diễn nội dung. Phần encoder văn bản biến chuỗi token chữ thành embedding theo cách tương tự. Hai dãy embedding được đưa vào một không gian biểu diễn chung, và phần decoder ngôn ngữ sinh ra văn bản đầu ra </w:t>
-      </w:r>
-      <w:proofErr w:type="spellStart"/>
-      <w:r>
-        <w:t>từ</w:t>
-      </w:r>
-      <w:proofErr w:type="spellEnd"/>
-      <w:r>
-        <w:t xml:space="preserve"> </w:t>
-      </w:r>
-      <w:proofErr w:type="spellStart"/>
-      <w:r>
-        <w:t>không</w:t>
-      </w:r>
-      <w:proofErr w:type="spellEnd"/>
-      <w:r>
-        <w:t xml:space="preserve"> </w:t>
-      </w:r>
-      <w:proofErr w:type="spellStart"/>
-      <w:r>
-        <w:t>gian</w:t>
-      </w:r>
-      <w:proofErr w:type="spellEnd"/>
-      <w:r>
-        <w:t xml:space="preserve"> </w:t>
-      </w:r>
-      <w:proofErr w:type="spellStart"/>
-      <w:r>
-        <w:t>đó</w:t>
-      </w:r>
-      <w:proofErr w:type="spellEnd"/>
-      <w:r>
-        <w:t>.</w:t>
+        <w:t>Một mô hình thị giác - ngôn ngữ tổng quát thường gồm ba phần. Phần encoder ảnh nhận ảnh đầu vào và biến nó thành một dãy embedding biểu diễn nội dung. Phần encoder văn bản biến chuỗi token chữ thành embedding theo cách tương tự. Hai dãy embedding được đưa vào một không gian biểu diễn chung, và phần decoder ngôn ngữ sinh ra văn bản đầu ra từ không gian đó.</w:t>
       </w:r>
     </w:p>
     <w:p>
@@ -11395,7 +10553,15 @@
         <w:pStyle w:val="BodyText1"/>
       </w:pPr>
       <w:r>
-        <w:t>LinVNix gồm ba ứng dụng chia sẻ chung một dịch vụ nền: ứng dụng di động cho học viên, trang quản trị cho người soạn học liệu, và máy chủ nghiệp vụ chạy các API cùng logic AI. Đặc tả ở phần này gọi tên các đối tượng người dùng, khoanh phạm vi tính năng và ghi nhận các ràng buộc nghiệp vụ; những quyết định thiết kế chi tiết hơn được trả về cho các mục sau.</w:t>
+        <w:t xml:space="preserve">LinVNix gồm ba ứng dụng chia sẻ chung một backend: ứng dụng di động cho học viên, trang quản trị cho người soạn học liệu, và máy chủ nghiệp vụ chạy các API </w:t>
+      </w:r>
+      <w:proofErr w:type="spellStart"/>
+      <w:r>
+        <w:t>cùng</w:t>
+      </w:r>
+      <w:proofErr w:type="spellEnd"/>
+      <w:r>
+        <w:t xml:space="preserve"> logic AI.</w:t>
       </w:r>
     </w:p>
     <w:p>
@@ -11421,7 +10587,61 @@
         <w:pStyle w:val="BodyText1"/>
       </w:pPr>
       <w:r>
-        <w:t>Sản phẩm phải đạt các mục tiêu kỹ thuật cụ thể như sau: chạy được trên cả ba nền tảng Android, iOS, máy tính để bàn cho hai vai trò học viên và quản trị viên; hỗ trợ chín ngôn ngữ giao diện để học viên đến từ nhiều quốc gia có thể dùng được; lưu trữ dữ liệu học liệu, tiến trình và hội thoại tập trung trên một cơ sở dữ liệu duy nhất; cho phép gọi mô hình AI đa phương thức cùng các công cụ tra cứu dữ liệu hệ thống; có khả năng triển khai trên hạ tầng đám mây ở mức chi phí thấp phù hợp với một đồ án sinh viên.</w:t>
+        <w:t xml:space="preserve">Sản phẩm phải đạt các mục tiêu kỹ thuật cụ thể như sau: chạy được trên cả </w:t>
+      </w:r>
+      <w:proofErr w:type="spellStart"/>
+      <w:r>
+        <w:t>hai</w:t>
+      </w:r>
+      <w:proofErr w:type="spellEnd"/>
+      <w:r>
+        <w:t xml:space="preserve"> </w:t>
+      </w:r>
+      <w:proofErr w:type="spellStart"/>
+      <w:r>
+        <w:t>nền</w:t>
+      </w:r>
+      <w:proofErr w:type="spellEnd"/>
+      <w:r>
+        <w:t xml:space="preserve"> </w:t>
+      </w:r>
+      <w:proofErr w:type="spellStart"/>
+      <w:r>
+        <w:t>tảng</w:t>
+      </w:r>
+      <w:proofErr w:type="spellEnd"/>
+      <w:r>
+        <w:t xml:space="preserve"> Android, </w:t>
+      </w:r>
+      <w:r>
+        <w:t>web</w:t>
+      </w:r>
+      <w:r>
+        <w:t xml:space="preserve"> </w:t>
+      </w:r>
+      <w:proofErr w:type="spellStart"/>
+      <w:r>
+        <w:t>cho</w:t>
+      </w:r>
+      <w:proofErr w:type="spellEnd"/>
+      <w:r>
+        <w:t xml:space="preserve"> </w:t>
+      </w:r>
+      <w:proofErr w:type="spellStart"/>
+      <w:r>
+        <w:t>hai</w:t>
+      </w:r>
+      <w:proofErr w:type="spellEnd"/>
+      <w:r>
+        <w:t xml:space="preserve"> </w:t>
+      </w:r>
+      <w:proofErr w:type="spellStart"/>
+      <w:r>
+        <w:t>vai</w:t>
+      </w:r>
+      <w:proofErr w:type="spellEnd"/>
+      <w:r>
+        <w:t xml:space="preserve"> trò học viên và quản trị viên; hỗ trợ chín ngôn ngữ giao diện để học viên đến từ nhiều quốc gia có thể dùng được; lưu trữ dữ liệu học liệu, tiến trình và hội thoại tập trung trên một cơ sở dữ liệu duy nhất; cho phép gọi mô hình AI đa phương thức cùng các công cụ tra cứu dữ liệu hệ thống; có khả năng triển khai trên hạ tầng đám mây ở mức chi phí thấp phù hợp với một đồ án sinh viên.</w:t>
       </w:r>
     </w:p>
     <w:p>
@@ -11474,11 +10694,14 @@
           <w:b/>
           <w:bCs/>
         </w:rPr>
+        <w:t>Quản trị viên (vai trò ADMIN):</w:t>
+      </w:r>
+      <w:r>
+        <w:t xml:space="preserve"> người chịu trách nhiệm soạn nội dung, theo dõi hoạt động hệ thống. Tài khoản quản trị viên được tạo qua công cụ dòng lệnh, không có quy trình tự đăng ký từ ứng dụng. Quản trị viên truy cập trang </w:t>
+      </w:r>
+      <w:r>
         <w:lastRenderedPageBreak/>
-        <w:t>Quản trị viên (vai trò ADMIN):</w:t>
-      </w:r>
-      <w:r>
-        <w:t xml:space="preserve"> người chịu trách nhiệm soạn nội dung, theo dõi hoạt động hệ thống. Tài khoản quản trị viên được tạo qua công cụ dòng lệnh, không có quy trình tự đăng ký từ ứng dụng. Quản trị viên truy cập trang quản trị để soạn khóa học, chủ đề, bài học, từ vựng, ngữ pháp, bài tập, tình huống mô phỏng, đồng thời theo dõi thống kê học tập của học viên.</w:t>
+        <w:t>quản trị để soạn khóa học, chủ đề, bài học, từ vựng, ngữ pháp, bài tập, tình huống mô phỏng, đồng thời theo dõi thống kê học tập của học viên.</w:t>
       </w:r>
     </w:p>
     <w:p>
@@ -11581,17 +10804,20 @@
       </w:pPr>
       <w:bookmarkStart w:id="30" w:name="_LinVNix854"/>
       <w:r>
+        <w:t>3.2 Phân tích chức năng</w:t>
+      </w:r>
+      <w:bookmarkEnd w:id="30"/>
+    </w:p>
+    <w:p>
+      <w:pPr>
+        <w:pStyle w:val="BodyText1"/>
+      </w:pPr>
+      <w:r>
+        <w:t xml:space="preserve">Sơ đồ ca sử dụng dưới đây liên kết hai tác nhân Học viên và Quản trị viên với các nhóm chức năng đã nêu ở mục 3.1.3. Bảng đi kèm chỉ chọn ra các ca quan trọng </w:t>
+      </w:r>
+      <w:r>
         <w:lastRenderedPageBreak/>
-        <w:t>3.2 Phân tích chức năng</w:t>
-      </w:r>
-      <w:bookmarkEnd w:id="30"/>
-    </w:p>
-    <w:p>
-      <w:pPr>
-        <w:pStyle w:val="BodyText1"/>
-      </w:pPr>
-      <w:r>
-        <w:t>Sơ đồ ca sử dụng dưới đây liên kết hai tác nhân Học viên và Quản trị viên với các nhóm chức năng đã nêu ở mục 3.1.3. Bảng đi kèm chỉ chọn ra các ca quan trọng nhất, ghi tiền điều kiện và kết quả mong đợi để làm điểm xuất phát cho thiết kế ở các mục sau.</w:t>
+        <w:t>nhất, ghi tiền điều kiện và kết quả mong đợi để làm điểm xuất phát cho thiết kế ở các mục sau.</w:t>
       </w:r>
     </w:p>
     <w:p>
@@ -11891,17 +11117,20 @@
       </w:pPr>
       <w:bookmarkStart w:id="33" w:name="_LinVNix857"/>
       <w:r>
+        <w:t>3.2.3 Mô tả các ca sử dụng chính</w:t>
+      </w:r>
+      <w:bookmarkEnd w:id="33"/>
+    </w:p>
+    <w:p>
+      <w:pPr>
+        <w:pStyle w:val="BodyText1"/>
+      </w:pPr>
+      <w:r>
+        <w:t xml:space="preserve">Bảng 3.2 mô tả tóm tắt sáu ca sử dụng tiêu biểu của Học viên, được chọn vì gắn trực tiếp với phần thiết kế dữ liệu, kiến trúc và quy trình AI ở các mục sau. Các </w:t>
+      </w:r>
+      <w:r>
         <w:lastRenderedPageBreak/>
-        <w:t>3.2.3 Mô tả các ca sử dụng chính</w:t>
-      </w:r>
-      <w:bookmarkEnd w:id="33"/>
-    </w:p>
-    <w:p>
-      <w:pPr>
-        <w:pStyle w:val="BodyText1"/>
-      </w:pPr>
-      <w:r>
-        <w:t>Bảng 3.2 mô tả tóm tắt sáu ca sử dụng tiêu biểu của Học viên, được chọn vì gắn trực tiếp với phần thiết kế dữ liệu, kiến trúc và quy trình AI ở các mục sau. Các ca khác có cấu trúc tương tự, được thực thi theo cùng cơ chế xác thực, phân quyền và lưu trữ.</w:t>
+        <w:t>ca khác có cấu trúc tương tự, được thực thi theo cùng cơ chế xác thực, phân quyền và lưu trữ.</w:t>
       </w:r>
     </w:p>
     <w:p>
@@ -12403,19 +11632,16 @@
         <w:pStyle w:val="BodyText1"/>
       </w:pPr>
       <w:r>
-        <w:t xml:space="preserve">Hệ thống dùng một cơ sở dữ liệu quan hệ duy nhất cho mọi mô đun nghiệp vụ. Lựa chọn này giúp đảm bảo tính toàn vẹn tham chiếu khi các thực thể có nhiều quan hệ chéo, đồng thời cho phép viết các truy vấn thống kê phức tạp cho trang quản trị. </w:t>
-      </w:r>
+        <w:t>Hệ thống dùng một cơ sở dữ liệu quan hệ duy nhất cho mọi mô đun nghiệp vụ. Lựa chọn này giúp đảm bảo tính toàn vẹn tham chiếu khi các thực thể có nhiều quan hệ chéo, đồng thời cho phép viết các truy vấn thống kê phức tạp cho trang quản trị. Lược đồ gồm 27 bảng được nhóm thành sáu cụm: tài khoản và xác thực, học liệu, luyện tập, tiến trình và mục tiêu, hội thoại với AI, hội thoại mô phỏng theo tình huống.</w:t>
+      </w:r>
+    </w:p>
+    <w:p>
+      <w:pPr>
+        <w:pStyle w:val="Heading3"/>
+      </w:pPr>
+      <w:bookmarkStart w:id="35" w:name="_LinVNix859"/>
       <w:r>
         <w:lastRenderedPageBreak/>
-        <w:t>Lược đồ gồm 27 bảng được nhóm thành sáu cụm: tài khoản và xác thực, học liệu, luyện tập, tiến trình và mục tiêu, hội thoại với AI, hội thoại mô phỏng theo tình huống.</w:t>
-      </w:r>
-    </w:p>
-    <w:p>
-      <w:pPr>
-        <w:pStyle w:val="Heading3"/>
-      </w:pPr>
-      <w:bookmarkStart w:id="35" w:name="_LinVNix859"/>
-      <w:r>
         <w:t>3.3.1 Sơ đồ thực thể liên kết</w:t>
       </w:r>
       <w:bookmarkEnd w:id="35"/>
@@ -12730,7 +11956,6 @@
               <w:spacing w:before="120" w:after="120"/>
             </w:pPr>
             <w:r>
-              <w:lastRenderedPageBreak/>
               <w:t>2</w:t>
             </w:r>
           </w:p>
@@ -12862,7 +12087,11 @@
               <w:spacing w:before="120" w:after="120"/>
             </w:pPr>
             <w:r>
-              <w:t>Mật khẩu đã băm. Tài khoản đăng nhập qua Google có thể không có giá trị.</w:t>
+              <w:t xml:space="preserve">Mật khẩu đã băm. Tài khoản đăng </w:t>
+            </w:r>
+            <w:r>
+              <w:lastRenderedPageBreak/>
+              <w:t>nhập qua Google có thể không có giá trị.</w:t>
             </w:r>
           </w:p>
         </w:tc>
@@ -12881,6 +12110,7 @@
               <w:spacing w:before="120" w:after="120"/>
             </w:pPr>
             <w:r>
+              <w:lastRenderedPageBreak/>
               <w:t>4</w:t>
             </w:r>
           </w:p>
@@ -13612,11 +12842,7 @@
               <w:spacing w:before="120" w:after="120"/>
             </w:pPr>
             <w:r>
-              <w:t xml:space="preserve">Thời điểm xóa mềm; bản ghi có giá </w:t>
-            </w:r>
-            <w:r>
-              <w:lastRenderedPageBreak/>
-              <w:t>trị này không lộ qua API.</w:t>
+              <w:t>Thời điểm xóa mềm; bản ghi có giá trị này không lộ qua API.</w:t>
             </w:r>
           </w:p>
         </w:tc>
@@ -13632,7 +12858,11 @@
         <w:pStyle w:val="BodyText1"/>
       </w:pPr>
       <w:r>
-        <w:t>Mọi bảng trong lược đồ đều kế thừa một bảng cơ sở quy định ba cột tạo lúc, sửa lúc và xóa lúc. Cơ chế xóa mềm được dùng nhất quán để hỗ trợ phục hồi dữ liệu và lưu vết. Các cột chứa dữ liệu thay đổi cấu trúc theo mục đích như danh sách biến thể phương ngữ trên bảng vocabularies, danh sách ví dụ trên bảng grammar_rules, cấu hình bài tập tùy chỉnh trên bảng exercises, ngữ cảnh màn hình trên bảng conversations, tiêu chí chấm điểm trên bảng scenarios đều dùng kiểu JSONB. Lựa chọn JSONB cho phép thay đổi cấu trúc dữ liệu phụ mà không phải sửa lược đồ, đồng thời vẫn truy vấn được bằng các toán tử của PostgreSQL.</w:t>
+        <w:t xml:space="preserve">Mọi bảng trong lược đồ đều kế thừa một bảng cơ sở quy định ba cột tạo lúc, sửa lúc và xóa lúc. Cơ chế xóa mềm được dùng nhất quán để hỗ trợ phục hồi dữ liệu </w:t>
+      </w:r>
+      <w:r>
+        <w:lastRenderedPageBreak/>
+        <w:t>và lưu vết. Các cột chứa dữ liệu thay đổi cấu trúc theo mục đích như danh sách biến thể phương ngữ trên bảng vocabularies, danh sách ví dụ trên bảng grammar_rules, cấu hình bài tập tùy chỉnh trên bảng exercises, ngữ cảnh màn hình trên bảng conversations, tiêu chí chấm điểm trên bảng scenarios đều dùng kiểu JSONB. Lựa chọn JSONB cho phép thay đổi cấu trúc dữ liệu phụ mà không phải sửa lược đồ, đồng thời vẫn truy vấn được bằng các toán tử của PostgreSQL.</w:t>
       </w:r>
     </w:p>
     <w:p>
@@ -14499,7 +13729,6 @@
                 <w:b/>
                 <w:bCs/>
               </w:rPr>
-              <w:lastRenderedPageBreak/>
               <w:t>STT</w:t>
             </w:r>
           </w:p>
@@ -14895,6 +14124,7 @@
               <w:spacing w:before="120" w:after="120"/>
             </w:pPr>
             <w:r>
+              <w:lastRenderedPageBreak/>
               <w:t>5</w:t>
             </w:r>
           </w:p>
@@ -16146,7 +15376,6 @@
               <w:spacing w:before="120" w:after="120"/>
             </w:pPr>
             <w:r>
-              <w:lastRenderedPageBreak/>
               <w:t>4</w:t>
             </w:r>
           </w:p>
@@ -16372,6 +15601,7 @@
               <w:spacing w:before="120" w:after="120"/>
             </w:pPr>
             <w:r>
+              <w:lastRenderedPageBreak/>
               <w:t>7</w:t>
             </w:r>
           </w:p>
@@ -17560,7 +16790,6 @@
               <w:spacing w:before="120" w:after="120"/>
             </w:pPr>
             <w:r>
-              <w:lastRenderedPageBreak/>
               <w:t>14</w:t>
             </w:r>
           </w:p>
@@ -17679,6 +16908,7 @@
                 <w:b/>
                 <w:bCs/>
               </w:rPr>
+              <w:lastRenderedPageBreak/>
               <w:t>STT</w:t>
             </w:r>
           </w:p>
@@ -18101,13 +17331,8 @@
             <w:pPr>
               <w:spacing w:before="120" w:after="120"/>
             </w:pPr>
-            <w:proofErr w:type="gramStart"/>
-            <w:r>
-              <w:t>varchar(</w:t>
-            </w:r>
-            <w:proofErr w:type="gramEnd"/>
-            <w:r>
-              <w:t>500)</w:t>
+            <w:r>
+              <w:t>varchar(500)</w:t>
             </w:r>
           </w:p>
         </w:tc>
@@ -18631,13 +17856,8 @@
             <w:pPr>
               <w:spacing w:before="120" w:after="120"/>
             </w:pPr>
-            <w:proofErr w:type="gramStart"/>
-            <w:r>
-              <w:t>varchar(</w:t>
-            </w:r>
-            <w:proofErr w:type="gramEnd"/>
-            <w:r>
-              <w:t>20)</w:t>
+            <w:r>
+              <w:t>varchar(20)</w:t>
             </w:r>
           </w:p>
         </w:tc>
@@ -18840,7 +18060,6 @@
           <w:i/>
           <w:iCs/>
         </w:rPr>
-        <w:lastRenderedPageBreak/>
         <w:t>Bảng 3.10. Mô tả các thuộc tính của thực thể "questions".</w:t>
       </w:r>
     </w:p>
@@ -19048,6 +18267,7 @@
               <w:spacing w:before="120" w:after="120"/>
             </w:pPr>
             <w:r>
+              <w:lastRenderedPageBreak/>
               <w:t>2</w:t>
             </w:r>
           </w:p>
@@ -20236,7 +19456,6 @@
               <w:spacing w:before="120" w:after="120"/>
             </w:pPr>
             <w:r>
-              <w:lastRenderedPageBreak/>
               <w:t>6</w:t>
             </w:r>
           </w:p>
@@ -20312,6 +19531,7 @@
               <w:spacing w:before="120" w:after="120"/>
             </w:pPr>
             <w:r>
+              <w:lastRenderedPageBreak/>
               <w:t>7</w:t>
             </w:r>
           </w:p>
@@ -21481,11 +20701,7 @@
               <w:spacing w:before="120" w:after="120"/>
             </w:pPr>
             <w:r>
-              <w:t xml:space="preserve">Danh sách tiêu chí chấm điểm; mỗi tiêu chí có tên, mô tả và </w:t>
-            </w:r>
-            <w:r>
-              <w:lastRenderedPageBreak/>
-              <w:t>trọng số phần trăm, tổng các trọng số bằng 100.</w:t>
+              <w:t>Danh sách tiêu chí chấm điểm; mỗi tiêu chí có tên, mô tả và trọng số phần trăm, tổng các trọng số bằng 100.</w:t>
             </w:r>
           </w:p>
         </w:tc>
@@ -21504,7 +20720,6 @@
               <w:spacing w:before="120" w:after="120"/>
             </w:pPr>
             <w:r>
-              <w:lastRenderedPageBreak/>
               <w:t>10</w:t>
             </w:r>
           </w:p>
@@ -21580,6 +20795,7 @@
               <w:spacing w:before="120" w:after="120"/>
             </w:pPr>
             <w:r>
+              <w:lastRenderedPageBreak/>
               <w:t>11</w:t>
             </w:r>
           </w:p>
@@ -22768,7 +21984,6 @@
               <w:spacing w:before="120" w:after="120"/>
             </w:pPr>
             <w:r>
-              <w:lastRenderedPageBreak/>
               <w:t>12</w:t>
             </w:r>
           </w:p>
@@ -22919,6 +22134,7 @@
               <w:spacing w:before="120" w:after="120"/>
             </w:pPr>
             <w:r>
+              <w:lastRenderedPageBreak/>
               <w:t>14</w:t>
             </w:r>
           </w:p>
@@ -23730,7 +22946,6 @@
               <w:spacing w:before="120" w:after="120"/>
             </w:pPr>
             <w:r>
-              <w:lastRenderedPageBreak/>
               <w:t>11</w:t>
             </w:r>
           </w:p>
@@ -23792,6 +23007,7 @@
               <w:spacing w:before="120" w:after="120"/>
             </w:pPr>
             <w:r>
+              <w:lastRenderedPageBreak/>
               <w:t>12</w:t>
             </w:r>
           </w:p>
@@ -24104,7 +23320,7 @@
         <w:pStyle w:val="BodyText1"/>
       </w:pPr>
       <w:r>
-        <w:t>Kiến trúc LinVNix tách thành ba tầng tách bạch: giao diện trên các ứng dụng khách, nghiệp vụ tập trung ở dịch vụ nền, và dữ liệu dùng chung cho toàn hệ thống. Phần dưới mô tả từng tầng, kèm hai luồng hoạt động cốt lõi của các tính năng AI là Trợ lý AI và Hội thoại mô phỏng.</w:t>
+        <w:t>Kiến trúc LinVNix tách thành ba tầng tách bạch: giao diện trên các ứng dụng khách, nghiệp vụ tập trung ở backend, và dữ liệu dùng chung cho toàn hệ thống. Phần dưới mô tả từng tầng, kèm hai luồng hoạt động cốt lõi của các tính năng AI là Trợ lý AI và Hội thoại mô phỏng.</w:t>
       </w:r>
     </w:p>
     <w:p>
@@ -24122,7 +23338,7 @@
         <w:pStyle w:val="BodyText1"/>
       </w:pPr>
       <w:r>
-        <w:t>Hình 3.3 thể hiện kiến trúc phân tầng của hệ thống. Ba ứng dụng phía người dùng gồm ứng dụng di động chạy trên Android, iOS; trang quản trị chạy trên Windows, macOS, Linux dưới dạng ứng dụng Electron hoặc trang web tĩnh; trang giới thiệu dạng Astro tĩnh phục vụ giới thiệu sản phẩm và tải về. Cả ba đều gọi vào một dịch vụ nền duy nhất qua REST API.</w:t>
+        <w:t>Hình 3.3 thể hiện kiến trúc phân tầng của hệ thống. Ba ứng dụng phía người dùng gồm ứng dụng di động chạy trên Android, iOS; trang quản trị chạy trên Windows, macOS, Linux dưới dạng ứng dụng Electron hoặc trang web tĩnh; trang giới thiệu dạng Astro tĩnh phục vụ giới thiệu sản phẩm và tải về. Cả ba đều gọi vào một backend duy nhất qua REST API.</w:t>
       </w:r>
     </w:p>
     <w:p>
@@ -24194,7 +23410,7 @@
         <w:pStyle w:val="BodyText1"/>
       </w:pPr>
       <w:r>
-        <w:t>Dịch vụ nền tổ chức theo ba lớp. Lớp cổng vào tiếp nhận yêu cầu HTTP, áp dụng xác thực JWT, kiểm tra phân quyền theo vai trò và quyền hạn, sau đó định tuyến tới các mô đun nghiệp vụ. Lớp ứng dụng nền gồm các mô đun nghiệp vụ, vòng lặp tác tử AI và hàng đợi tác vụ nền. Lớp dữ liệu lưu cơ sở dữ liệu chính, bộ nhớ đệm và các tác vụ hàng đợi. Ngoài hệ thống là ba dịch vụ phụ thuộc gồm nhà cung cấp mô hình AI đa phương thức, dịch vụ gửi thư và máy chủ OAuth Google.</w:t>
+        <w:t>Backend tổ chức theo ba lớp. Lớp cổng vào tiếp nhận yêu cầu HTTP, áp dụng xác thực JWT, kiểm tra phân quyền theo vai trò và quyền hạn, sau đó định tuyến tới các mô đun nghiệp vụ. Lớp ứng dụng gồm các mô đun nghiệp vụ, vòng lặp tác tử AI và hàng đợi tác vụ nền. Lớp dữ liệu lưu cơ sở dữ liệu chính, bộ nhớ đệm và các tác vụ hàng đợi. Ngoài hệ thống là ba dịch vụ phụ thuộc gồm nhà cung cấp mô hình AI đa phương thức, dịch vụ gửi thư và máy chủ OAuth Google.</w:t>
       </w:r>
     </w:p>
     <w:p>
@@ -24203,7 +23419,7 @@
       </w:pPr>
       <w:bookmarkStart w:id="39" w:name="_LinVNix863"/>
       <w:r>
-        <w:t>3.4.2 Tổ chức ứng dụng nền</w:t>
+        <w:t>3.4.2 Tổ chức backend</w:t>
       </w:r>
       <w:bookmarkEnd w:id="39"/>
     </w:p>
@@ -24212,7 +23428,7 @@
         <w:pStyle w:val="BodyText1"/>
       </w:pPr>
       <w:r>
-        <w:t>Ứng dụng nền viết bằng TypeScript trên nền NestJS 11. Mã nguồn tổ chức theo các mô đun độc lập, mỗi mô đun bao gọn một nhóm nghiệp vụ và xuất ra các API riêng. Cấu trúc cao tầng được chia thành ba thư mục lớn.</w:t>
+        <w:t>Backend viết bằng TypeScript trên nền NestJS 11. Mã nguồn tổ chức theo các mô đun độc lập, mỗi mô đun bao gọn một nhóm nghiệp vụ và xuất ra các API riêng. Tổng thể được tách thành ba nhóm thành phần chính như sau.</w:t>
       </w:r>
     </w:p>
     <w:p>
@@ -24228,10 +23444,10 @@
           <w:b/>
           <w:bCs/>
         </w:rPr>
-        <w:t>modules:</w:t>
-      </w:r>
-      <w:r>
-        <w:t xml:space="preserve"> chứa 17 mô đun nghiệp vụ tương ứng các bảng dữ liệu chính, gồm auth, users, courses, contents, vocabularies, grammar, exercises, progress, daily-goals, conversations, agent, ai, image-analysis, personal-vocabularies, simulations, uploads và admin. Mỗi mô đun chia ba tầng controllers, application, domain để tách lớp giao diện, dịch vụ và thực thể.</w:t>
+        <w:t>Nhóm mô đun nghiệp vụ:</w:t>
+      </w:r>
+      <w:r>
+        <w:t xml:space="preserve"> gồm 17 mô đun tương ứng các bảng dữ liệu chính: auth, users, courses, contents, vocabularies, grammar, exercises, progress, daily-goals, conversations, agent, ai, image-analysis, personal-vocabularies, simulations, uploads và admin. Mỗi mô đun phân thành ba tầng controllers, application, domain để tách lớp giao diện, dịch vụ và thực thể.</w:t>
       </w:r>
     </w:p>
     <w:p>
@@ -24248,10 +23464,10 @@
           <w:bCs/>
         </w:rPr>
         <w:lastRenderedPageBreak/>
-        <w:t>infrastructure:</w:t>
-      </w:r>
-      <w:r>
-        <w:t xml:space="preserve"> chứa các thành phần dùng chung gồm bộ nhớ đệm Redis, hệ thống ghi log, gửi thư, hàng đợi Bull, lưu trữ tệp, cùng tầng trừu tượng cho nhà cung cấp AI gồm bộ định tuyến giữa các nhà cung cấp và quỹ khóa API với cơ chế xoay vòng và đếm thời gian chờ khi vượt hạn mức.</w:t>
+        <w:t>Tầng hạ tầng (infrastructure):</w:t>
+      </w:r>
+      <w:r>
+        <w:t xml:space="preserve"> gồm các thành phần dùng chung: bộ nhớ đệm Redis, hệ thống ghi log, gửi thư, hàng đợi Bull, lưu trữ tệp, cùng tầng trừu tượng cho nhà cung cấp AI với bộ định tuyến giữa các nhà cung cấp và quỹ khóa API có cơ chế xoay vòng và đếm thời gian chờ khi vượt hạn mức.</w:t>
       </w:r>
     </w:p>
     <w:p>
@@ -24267,10 +23483,10 @@
           <w:b/>
           <w:bCs/>
         </w:rPr>
-        <w:t>common:</w:t>
-      </w:r>
-      <w:r>
-        <w:t xml:space="preserve"> chứa các tiện ích dùng xuyên suốt như guard kiểm tra JWT và quyền hạn, bộ chặn ghi log và biến đổi response, các decorator @CurrentUser, @Roles, @Public, @Transactional, các bộ lọc lỗi và một bộ liệt kê enum dùng chung cho mọi mô đun.</w:t>
+        <w:t>Tiện ích dùng chung (common):</w:t>
+      </w:r>
+      <w:r>
+        <w:t xml:space="preserve"> gồm các tiện ích xuyên suốt: guard kiểm tra JWT và quyền hạn, bộ chặn ghi log và biến đổi response, các decorator @CurrentUser, @Roles, @Public, @Transactional, các bộ lọc lỗi và một bộ liệt kê enum dùng chung cho mọi mô đun.</w:t>
       </w:r>
     </w:p>
     <w:p>
@@ -24296,7 +23512,7 @@
         <w:pStyle w:val="BodyText1"/>
       </w:pPr>
       <w:r>
-        <w:t>Ứng dụng di động viết bằng Flutter 3 và Dart, dùng chung mã nguồn cho cả Android và iOS. Mã nguồn chia thành ba thư mục lớn: core chứa các thành phần dùng chung, features chứa các tính năng theo lát cắt nghiệp vụ, và l10n chứa các tệp dịch thuật.</w:t>
+        <w:t>Ứng dụng di động viết bằng Flutter 3 và Dart, dùng chung mã nguồn cho cả Android và iOS. Mã nguồn được tổ chức theo ba lớp thành phần: lớp nền tảng (core) cung cấp các dịch vụ dùng chung, lớp tính năng (features) hiện thực các nghiệp vụ học viên theo lát cắt, và lớp đa ngôn ngữ (l10n) gói các bản dịch giao diện.</w:t>
       </w:r>
     </w:p>
     <w:p>
@@ -24312,10 +23528,10 @@
           <w:b/>
           <w:bCs/>
         </w:rPr>
-        <w:t>core:</w:t>
-      </w:r>
-      <w:r>
-        <w:t xml:space="preserve"> gồm các thư mục con router cho điều hướng dùng go_router; providers chứa các provider Riverpod làm container tiêm phụ thuộc; theme cấu hình màu, font và thành phần Material; storage gói các phụ thuộc lưu trữ cục bộ gồm flutter_secure_storage, shared_preferences và Hive; network cấu hình Dio kèm bộ chặn đính token vào header; services chứa API client và sync chứa các thành phần đồng bộ với cơ sở dữ liệu cục bộ Drift. [17]</w:t>
+        <w:t>Lớp nền tảng (core):</w:t>
+      </w:r>
+      <w:r>
+        <w:t xml:space="preserve"> gồm các thành phần dùng chung: router cho điều hướng dùng go_router; providers Riverpod làm container tiêm phụ thuộc; theme cấu hình màu, font và thành phần Material; lớp lưu trữ cục bộ gói flutter_secure_storage, shared_preferences và Hive; lớp mạng cấu hình Dio kèm bộ chặn đính token vào header; lớp dịch vụ chứa API client và lớp đồng bộ làm việc với cơ sở dữ liệu cục bộ Drift. [17]</w:t>
       </w:r>
     </w:p>
     <w:p>
@@ -24331,14 +23547,14 @@
           <w:b/>
           <w:bCs/>
         </w:rPr>
-        <w:t>features:</w:t>
-      </w:r>
-      <w:r>
-        <w:t xml:space="preserve"> gồm 11 thư mục tương ứng các tính năng: auth, onboarding, home, courses, lessons, bookmarks, daily_goals, assistant, image_discovery, simulation và profile. Mỗi tính năng chia thành các thư mục con data, domain, </w:t>
+        <w:t>Lớp tính năng (features):</w:t>
+      </w:r>
+      <w:r>
+        <w:t xml:space="preserve"> gồm 11 mô đun tương ứng các nghiệp vụ: auth, onboarding, home, courses, lessons, bookmarks, daily_goals, assistant, image_discovery, simulation và profile. Mỗi mô đun phân thành ba tầng data, </w:t>
       </w:r>
       <w:r>
         <w:lastRenderedPageBreak/>
-        <w:t>presentation theo mô hình Clean Architecture để tách lớp truy cập dữ liệu, logic nghiệp vụ và giao diện.</w:t>
+        <w:t>domain, presentation theo mô hình Clean Architecture để tách lớp truy cập dữ liệu, logic nghiệp vụ và giao diện.</w:t>
       </w:r>
     </w:p>
     <w:p>
@@ -24354,18 +23570,10 @@
           <w:b/>
           <w:bCs/>
         </w:rPr>
-        <w:t>l10n:</w:t>
-      </w:r>
-      <w:r>
-        <w:t xml:space="preserve"> hỗ trợ chín ngôn ngữ giao diện gồm tiếng Anh, tiếng Việt, tiếng Đức, tiếng Tây Ban Nha, tiếng Pháp, tiếng Nhật, tiếng Hàn, tiếng Thái, tiếng Trung. Các </w:t>
-      </w:r>
-      <w:proofErr w:type="gramStart"/>
-      <w:r>
-        <w:t>tệp .arb</w:t>
-      </w:r>
-      <w:proofErr w:type="gramEnd"/>
-      <w:r>
-        <w:t xml:space="preserve"> được biên dịch sang lớp Dart bằng flutter gen-l10n tại bước build, không cần ghi nhớ thủ công các khóa chuỗi.</w:t>
+        <w:t>Lớp đa ngôn ngữ (l10n):</w:t>
+      </w:r>
+      <w:r>
+        <w:t xml:space="preserve"> hỗ trợ chín ngôn ngữ giao diện gồm tiếng Anh, tiếng Việt, tiếng Đức, tiếng Tây Ban Nha, tiếng Pháp, tiếng Nhật, tiếng Hàn, tiếng Thái, tiếng Trung. Các tệp .arb được biên dịch sang lớp Dart bằng flutter gen-l10n tại bước build, không cần ghi nhớ thủ công các khóa chuỗi.</w:t>
       </w:r>
     </w:p>
     <w:p>
@@ -24391,7 +23599,7 @@
         <w:pStyle w:val="BodyText1"/>
       </w:pPr>
       <w:r>
-        <w:t>Trang quản trị là ứng dụng dạng kép, hỗ trợ chạy như ứng dụng desktop trên Electron và như ứng dụng web tĩnh. Mã nguồn chia thành hai phần: thư mục lib gói tầng nền của Electron gồm tiến trình chính, tiến trình preload và lớp trừu tượng nền tảng cho các API hệ điều hành; thư mục app chứa giao diện React render trong tiến trình con.</w:t>
+        <w:t>Trang quản trị là ứng dụng dạng kép, hỗ trợ chạy như ứng dụng desktop trên Electron và như ứng dụng web tĩnh. Mã nguồn được tổ chức theo hai tiến trình: tầng nền Electron (lib) gói tiến trình chính, tiến trình preload và lớp trừu tượng nền tảng cho các API hệ điều hành; tầng giao diện (app) hiện thực bằng React và render trong tiến trình con.</w:t>
       </w:r>
     </w:p>
     <w:p>
@@ -24429,7 +23637,7 @@
         <w:t>Cấu trúc tính năng:</w:t>
       </w:r>
       <w:r>
-        <w:t xml:space="preserve"> thư mục features chia thành bảy nhóm chính gồm auth, dashboard, learners, learning, simulations, uploads và settings. Nhóm learning là phần lớn nhất, gồm các trang soạn khóa học, chủ đề, bài học, nội dung bài, từ vựng, ngữ pháp và bài tập theo đúng giai đoạn soạn bài: nội dung trước, bài tập sau. Mỗi loại mục được soạn ở form riêng với loại đã khóa từ cổng vào.</w:t>
+        <w:t xml:space="preserve"> tầng giao diện được tổ chức thành bảy mô đun nghiệp vụ gồm auth, dashboard, learners, learning, simulations, uploads và settings. Mô đun learning là phần lớn nhất, gồm các trang soạn khóa học, chủ đề, bài học, nội dung bài, từ vựng, ngữ pháp và bài tập theo đúng giai đoạn soạn bài: nội dung trước, bài tập sau. Mỗi loại mục được soạn ở form riêng với loại đã khóa từ cổng vào.</w:t>
       </w:r>
     </w:p>
     <w:p>
@@ -24437,19 +23645,8 @@
         <w:pStyle w:val="BodyText1"/>
       </w:pPr>
       <w:r>
-        <w:t xml:space="preserve">Để đóng gói thành tệp cài đặt, dự án dùng electron-vite cho khâu build và electron-builder cho khâu sinh tệp .exe cho Windows, .dmg cho macOS, .deb </w:t>
-      </w:r>
-      <w:proofErr w:type="gramStart"/>
-      <w:r>
-        <w:t xml:space="preserve">và </w:t>
-      </w:r>
-      <w:r>
         <w:lastRenderedPageBreak/>
-        <w:t>.AppImage</w:t>
-      </w:r>
-      <w:proofErr w:type="gramEnd"/>
-      <w:r>
-        <w:t xml:space="preserve"> cho Linux. Cùng mã nguồn còn xuất được phiên bản web tĩnh chạy thẳng trong trình duyệt; tính năng nào cần API hệ thống được trừu tượng qua lớp platform để khi chạy ở môi trường web sẽ dùng fallback web.</w:t>
+        <w:t>Để đóng gói thành tệp cài đặt, dự án dùng electron-vite cho khâu build và electron-builder cho khâu sinh tệp .exe cho Windows, .dmg cho macOS, .deb và .AppImage cho Linux. Cùng mã nguồn còn xuất được phiên bản web tĩnh chạy thẳng trong trình duyệt; tính năng nào cần API hệ thống được trừu tượng qua lớp platform để khi chạy ở môi trường web sẽ dùng fallback web.</w:t>
       </w:r>
     </w:p>
     <w:p>
@@ -24547,6 +23744,7 @@
       </w:pPr>
       <w:bookmarkStart w:id="43" w:name="_LinVNix867"/>
       <w:r>
+        <w:lastRenderedPageBreak/>
         <w:t>3.4.6 Quy trình hội thoại mô phỏng</w:t>
       </w:r>
       <w:bookmarkEnd w:id="43"/>
@@ -24556,11 +23754,7 @@
         <w:pStyle w:val="BodyText1"/>
       </w:pPr>
       <w:r>
-        <w:t xml:space="preserve">Hội thoại mô phỏng dùng kênh giao tiếp đồng bộ thay vì phát dòng vì mỗi lượt nhắn ngắn và đi kèm nhiều siêu dữ liệu như danh sách sửa lỗi và nhận xét chi tiết. Khi học viên bắt đầu phiên, máy chủ tạo bản ghi phiên ở trạng thái ACTIVE, sinh tin </w:t>
-      </w:r>
-      <w:r>
-        <w:lastRenderedPageBreak/>
-        <w:t>nhắn mở đầu nếu tình huống không có sẵn lời mở. Mỗi tin nhắn sau đó kèm trường nextTurnCharacterId để mô tả nhân vật sẽ nhắn tiếp theo: nếu trùng nhân vật học viên, ứng dụng di động hiển thị ô nhập; nếu trùng nhân vật AI, ứng dụng gọi tiếp API để AI sinh phản hồi. Hình 3.5 mô tả tuần tự một phiên đầy đủ.</w:t>
+        <w:t>Hội thoại mô phỏng dùng kênh giao tiếp đồng bộ thay vì phát dòng vì mỗi lượt nhắn ngắn và đi kèm nhiều siêu dữ liệu như danh sách sửa lỗi và nhận xét chi tiết. Khi học viên bắt đầu phiên, máy chủ tạo bản ghi phiên ở trạng thái ACTIVE, sinh tin nhắn mở đầu nếu tình huống không có sẵn lời mở. Mỗi tin nhắn sau đó kèm trường nextTurnCharacterId để mô tả nhân vật sẽ nhắn tiếp theo: nếu trùng nhân vật học viên, ứng dụng di động hiển thị ô nhập; nếu trùng nhân vật AI, ứng dụng gọi tiếp API để AI sinh phản hồi. Hình 3.5 mô tả tuần tự một phiên đầy đủ.</w:t>
       </w:r>
     </w:p>
     <w:p>
@@ -24640,6 +23834,7 @@
       </w:pPr>
       <w:bookmarkStart w:id="44" w:name="_LinVNix868"/>
       <w:r>
+        <w:lastRenderedPageBreak/>
         <w:t>3.5 Triển khai</w:t>
       </w:r>
       <w:bookmarkEnd w:id="44"/>
@@ -24658,7 +23853,6 @@
       </w:pPr>
       <w:bookmarkStart w:id="45" w:name="_LinVNix869"/>
       <w:r>
-        <w:lastRenderedPageBreak/>
         <w:t>3.5.1 Môi trường phát triển cục bộ</w:t>
       </w:r>
       <w:bookmarkEnd w:id="45"/>
@@ -24668,7 +23862,7 @@
         <w:pStyle w:val="BodyText1"/>
       </w:pPr>
       <w:r>
-        <w:t>Toàn bộ dịch vụ phụ thuộc của dịch vụ nền được khai báo trong tệp docker-compose.yml ở thư mục gốc của kho mã nguồn. Tệp này định nghĩa ba dịch vụ gồm cơ sở dữ liệu, bộ nhớ đệm và dịch vụ nền.</w:t>
+        <w:t>Toàn bộ dịch vụ phụ thuộc của backend được khai báo trong tệp docker-compose.yml ở thư mục gốc của kho mã nguồn. Tệp này định nghĩa ba dịch vụ gồm cơ sở dữ liệu, bộ nhớ đệm và backend.</w:t>
       </w:r>
     </w:p>
     <w:p>
@@ -24722,7 +23916,7 @@
           <w:b/>
           <w:bCs/>
         </w:rPr>
-        <w:t>Dịch vụ nền backend:</w:t>
+        <w:t>Backend:</w:t>
       </w:r>
       <w:r>
         <w:t xml:space="preserve"> build từ tệp backend/Dockerfile theo mẫu nhiều bước trên ảnh oven/bun:1.3-alpine, đầu tiên cài phụ thuộc và build mã, sau đó copy sang ảnh runner mỏng để chạy. Dịch vụ phụ thuộc postgres và redis, mở cổng 3000, gắn ổ đĩa cho thư mục uploads và logs.</w:t>
@@ -24733,47 +23927,7 @@
         <w:pStyle w:val="BodyText1"/>
       </w:pPr>
       <w:r>
-        <w:t xml:space="preserve">Lập trình viên sao </w:t>
-      </w:r>
-      <w:proofErr w:type="gramStart"/>
-      <w:r>
-        <w:t>tệp .env</w:t>
-      </w:r>
-      <w:proofErr w:type="gramEnd"/>
-      <w:r>
-        <w:t xml:space="preserve"> mẫu, chạy lệnh bun run </w:t>
-      </w:r>
-      <w:proofErr w:type="gramStart"/>
-      <w:r>
-        <w:t>db:up</w:t>
-      </w:r>
-      <w:proofErr w:type="gramEnd"/>
-      <w:r>
-        <w:t xml:space="preserve"> để dựng cơ sở dữ liệu và bộ nhớ đệm, bun run </w:t>
-      </w:r>
-      <w:proofErr w:type="gramStart"/>
-      <w:r>
-        <w:t>backend:dev</w:t>
-      </w:r>
-      <w:proofErr w:type="gramEnd"/>
-      <w:r>
-        <w:t xml:space="preserve"> để chạy dịch vụ nền với chế độ tải lại nóng. Ứng dụng di động chạy qua flutter run trỏ vào đường dẫn cổng API trên máy phát triển. Trang quản trị chạy qua bun run </w:t>
-      </w:r>
-      <w:proofErr w:type="gramStart"/>
-      <w:r>
-        <w:t>admin:dev</w:t>
-      </w:r>
-      <w:proofErr w:type="gramEnd"/>
-      <w:r>
-        <w:t xml:space="preserve"> cho chế độ Electron hoặc bun run </w:t>
-      </w:r>
-      <w:proofErr w:type="gramStart"/>
-      <w:r>
-        <w:t>admin:dev</w:t>
-      </w:r>
-      <w:proofErr w:type="gramEnd"/>
-      <w:r>
-        <w:t>:web cho chế độ web. Cách làm này cho phép cả nhóm phát triển song song mà không vướng nhau.</w:t>
+        <w:t>Lập trình viên sao tệp .env mẫu, chạy lệnh bun run db:up để dựng cơ sở dữ liệu và bộ nhớ đệm, bun run backend:dev để chạy backend với chế độ tải lại nóng. Ứng dụng di động chạy qua flutter run trỏ vào đường dẫn cổng API trên máy phát triển. Trang quản trị chạy qua bun run admin:dev cho chế độ Electron hoặc bun run admin:dev:web cho chế độ web. Cách làm này cho phép cả nhóm phát triển song song mà không vướng nhau.</w:t>
       </w:r>
     </w:p>
     <w:p>
@@ -24863,7 +24017,7 @@
         <w:pStyle w:val="BodyText1"/>
       </w:pPr>
       <w:r>
-        <w:t>Dịch vụ nền được đóng gói cùng tệp Dockerfile và đẩy lên một Space của Hugging Face Spaces. Space dạng Docker tự build và chạy ảnh, đồng thời cấp một tên miền HTTPS công khai cho các ứng dụng khách gọi vào. Cơ sở dữ liệu chuyển từ PostgreSQL cục bộ sang CockroachDB Serverless: dịch vụ này tương thích giao thức PostgreSQL nên không phải sửa mã nguồn, chỉ thay đổi chuỗi kết nối. Bộ nhớ đệm chuyển sang Aiven for Valkey: Valkey là bản fork của Redis nên các thư viện ioredis trên dịch vụ nền không phải đổi. [19] [20] [21]</w:t>
+        <w:t>Backend được đóng gói cùng tệp Dockerfile và đẩy lên một Space của Hugging Face Spaces. Space dạng Docker tự build và chạy ảnh, đồng thời cấp một tên miền HTTPS công khai cho các ứng dụng khách gọi vào. Cơ sở dữ liệu chuyển từ PostgreSQL cục bộ sang CockroachDB Serverless: dịch vụ này tương thích giao thức PostgreSQL nên không phải sửa mã nguồn, chỉ thay đổi chuỗi kết nối. Bộ nhớ đệm chuyển sang Aiven for Valkey: Valkey là bản fork của Redis nên các thư viện ioredis trên backend không phải đổi. [19] [20] [21]</w:t>
       </w:r>
     </w:p>
     <w:p>
@@ -24871,31 +24025,7 @@
         <w:pStyle w:val="BodyText1"/>
       </w:pPr>
       <w:r>
-        <w:t xml:space="preserve">Các tệp cài đặt cho trang quản trị được build bằng lệnh bun run </w:t>
-      </w:r>
-      <w:proofErr w:type="gramStart"/>
-      <w:r>
-        <w:t>admin:build</w:t>
-      </w:r>
-      <w:proofErr w:type="gramEnd"/>
-      <w:r>
-        <w:t xml:space="preserve">:win, </w:t>
-      </w:r>
-      <w:proofErr w:type="gramStart"/>
-      <w:r>
-        <w:t>admin:build</w:t>
-      </w:r>
-      <w:proofErr w:type="gramEnd"/>
-      <w:r>
-        <w:t xml:space="preserve">:mac, </w:t>
-      </w:r>
-      <w:proofErr w:type="gramStart"/>
-      <w:r>
-        <w:t>admin:build</w:t>
-      </w:r>
-      <w:proofErr w:type="gramEnd"/>
-      <w:r>
-        <w:t>:linux và phát hành kèm trang giới thiệu. Ứng dụng di động được build qua flutter build apk cho Android và flutter build ios cho iOS, sau đó tải lên cửa hàng tương ứng hoặc phân phối trực tiếp cho học viên thử nghiệm. Toàn bộ tham số nhạy cảm như khóa API, mật khẩu cơ sở dữ liệu được khai báo qua biến môi trường ở phía Space, không đẩy vào kho mã nguồn.</w:t>
+        <w:t>Các tệp cài đặt cho trang quản trị được build bằng lệnh bun run admin:build:win, admin:build:mac, admin:build:linux và phát hành kèm trang giới thiệu. Ứng dụng di động được build qua flutter build apk cho Android và flutter build ios cho iOS, sau đó tải lên cửa hàng tương ứng hoặc phân phối trực tiếp cho học viên thử nghiệm. Toàn bộ tham số nhạy cảm như khóa API, mật khẩu cơ sở dữ liệu được khai báo qua biến môi trường ở phía Space, không đẩy vào kho mã nguồn.</w:t>
       </w:r>
     </w:p>
     <w:p>
@@ -25380,7 +24510,7 @@
         <w:pStyle w:val="BodyText1"/>
       </w:pPr>
       <w:r>
-        <w:t>Đề tài đã hoàn thành nền tảng LinVNix gồm ba thành phần: ứng dụng di động cho học viên, trang quản trị cho người soạn học liệu, và dịch vụ nền dùng chung. Các kết quả cụ thể như sau.</w:t>
+        <w:t>Đề tài đã hoàn thành nền tảng LinVNix gồm ba thành phần: ứng dụng di động cho học viên, trang quản trị cho người soạn học liệu, và backend dùng chung. Các kết quả cụ thể như sau.</w:t>
       </w:r>
     </w:p>
     <w:p>
@@ -25453,7 +24583,7 @@
           <w:b/>
           <w:bCs/>
         </w:rPr>
-        <w:t>Xây dựng dịch vụ nền:</w:t>
+        <w:t>Xây dựng backend:</w:t>
       </w:r>
       <w:r>
         <w:t xml:space="preserve"> viết bằng NestJS chạy trên Bun, kết nối PostgreSQL và Redis. Cung cấp các API REST có tài liệu Swagger; tích hợp vòng lặp tác tử AI với chín công cụ tra cứu chỉ đọc; triển khai được trên Hugging Face Spaces kết hợp CockroachDB Serverless và Aiven for Valkey.</w:t>
@@ -25827,15 +24957,7 @@
                 <w:t>[10]</w:t>
               </w:r>
               <w:r>
-                <w:t xml:space="preserve"> Radford A., Kim J. W., Hallacy C. và cộng sự (2021), Learning Transferable Visual Models </w:t>
-              </w:r>
-              <w:proofErr w:type="gramStart"/>
-              <w:r>
-                <w:t>From</w:t>
-              </w:r>
-              <w:proofErr w:type="gramEnd"/>
-              <w:r>
-                <w:t xml:space="preserve"> Natural Language Supervision, Proceedings of the 38th International Conference on Machine Learning (ICML), tr. 8748–8763.</w:t>
+                <w:t xml:space="preserve"> Radford A., Kim J. W., Hallacy C. và cộng sự (2021), Learning Transferable Visual Models From Natural Language Supervision, Proceedings of the 38th International Conference on Machine Learning (ICML), tr. 8748–8763.</w:t>
               </w:r>
             </w:p>
             <w:p>
@@ -28979,6 +28101,7 @@
   <w:style w:type="character" w:default="1" w:styleId="DefaultParagraphFont">
     <w:name w:val="Default Paragraph Font"/>
     <w:uiPriority w:val="1"/>
+    <w:semiHidden/>
     <w:unhideWhenUsed/>
   </w:style>
   <w:style w:type="table" w:default="1" w:styleId="TableNormal">

</xml_diff>